<commit_message>
Tina Parte 3: revisão
Co-Authored-By: Claude Opus 5.5 <noreply@anthropic.com>
Claude-Session: https://claude.ai/code/session_01MJjUEEZrxQDEUifKK2vj9g
</commit_message>
<xml_diff>
--- a/roteiros/tina-turner/Tina_Parte3.docx
+++ b/roteiros/tina-turner/Tina_Parte3.docx
@@ -23,7 +23,7 @@
         <w:rPr>
           <w:color w:val="000000"/>
         </w:rPr>
-        <w:t>Ike e Tina estavam no auge. Shows lotados, discos tocando nas rádios, a banda viajando de cidade em cidade sem parar.</w:t>
+        <w:t>Ike e Tina estavam no auge, com shows lotados e a banda viajando de cidade em cidade sem parar.</w:t>
       </w:r>
     </w:p>
     <w:p>
@@ -143,7 +143,7 @@
         <w:rPr>
           <w:color w:val="C00000"/>
         </w:rPr>
-        <w:t>Imagine por um momento acordar numa cama de hospital, depois de tentar ir embora da própria vida, e a primeira pessoa a entrar no quarto ser exatamente aquela de quem você estava tentando fugir.</w:t>
+        <w:t>Imagine por um momento acordar numa cama de hospital, depois de tentar ir embora da própria vida, e ver entrar no quarto exatamente a pessoa de quem você estava tentando fugir.</w:t>
       </w:r>
     </w:p>
     <w:p>
@@ -159,7 +159,7 @@
         <w:rPr>
           <w:color w:val="000000"/>
         </w:rPr>
-        <w:t>Segundo as reportagens sobre o relato de Tina, ele não chegou preocupado. Chegou irritado. Disse a ela palavras duras e cruéis.</w:t>
+        <w:t>Segundo as reportagens sobre o relato de Tina, ele chegou irritado e disse a ela palavras duras e cruéis.</w:t>
       </w:r>
     </w:p>
     <w:p>
@@ -191,7 +191,7 @@
         <w:rPr>
           <w:color w:val="000000"/>
         </w:rPr>
-        <w:t>A banda precisava da voz dela. A agenda precisava ser cumprida. O dinheiro precisava continuar entrando.</w:t>
+        <w:t>A agenda precisava ser cumprida, e o dinheiro precisava continuar entrando.</w:t>
       </w:r>
     </w:p>
     <w:p>
@@ -271,7 +271,7 @@
         <w:rPr>
           <w:color w:val="000000"/>
         </w:rPr>
-        <w:t>Era ali que a dupla gravava. Era ali que Ike passava as madrugadas. E era ali que ele mandava em tudo.</w:t>
+        <w:t>Era ali que a dupla gravava, e era ali que Ike mandava em tudo.</w:t>
       </w:r>
     </w:p>
     <w:p>
@@ -279,7 +279,7 @@
         <w:rPr>
           <w:color w:val="000000"/>
         </w:rPr>
-        <w:t>Por fora, Ike e Tina eram o retrato de um casal que tinha dado certo. Ganharam o Grammy. Tocavam na televisão. Viajavam o mundo.</w:t>
+        <w:t>Por fora, Ike e Tina eram o retrato de um casal que tinha dado certo. Ganharam o Grammy e viajavam o mundo.</w:t>
       </w:r>
     </w:p>
     <w:p>
@@ -400,6 +400,22 @@
           <w:color w:val="000000"/>
         </w:rPr>
         <w:t>O público começava a enxergar Tina Turner como uma artista. E não só como a metade de uma dupla.</w:t>
+      </w:r>
+    </w:p>
+    <w:p>
+      <w:r>
+        <w:rPr>
+          <w:color w:val="000000"/>
+        </w:rPr>
+        <w:t>Naquele mesmo ano, o show da dupla ganhou um nome novo nos cartazes. Ike &amp; Tina Turner Explosion.</w:t>
+      </w:r>
+    </w:p>
+    <w:p>
+      <w:r>
+        <w:rPr>
+          <w:color w:val="000000"/>
+        </w:rPr>
+        <w:t>Uma explosão. Era exatamente o que estava para acontecer longe dos palcos.</w:t>
       </w:r>
     </w:p>
     <w:p>

</xml_diff>